<commit_message>
chore: sync pending tree — applications, watchlist growth, resume refresh
Accumulated state from the 2026-07-12 apply/sourcing sessions:

- data/applications.json: tracker now at 52 records (48 submitted, 4
  manual_submission) after the batch runs; history.json grew accordingly.
- watchlist.yaml: +12 companies (Harvey, Zip, Abridge, Alpaca, Cresta,
  Replit, Mixpanel, ElevenLabs, Modern Treasury, Benepass, ...) -> ~46 total.
- job_criteria.yaml: search_defaults titles expanded with S&O/BizOps/
  Chief-of-Staff variants.
- resume.pdf/.docx/.txt: refreshed resume — Audare AI now correctly dated
  March-November 2025 (closes the stale-"Ongoing" open item).
- scripts/token_report.py + data/token_usage.jsonl: token-usage report
  tooling from the JOB-52 measurement work, now tracked.

Docs reconciled: watchlist counts in README/USER_GUIDE/SESSION_HANDOFF,
applications summary compressed to counts, resume open item marked done.

Co-Authored-By: Claude Opus 4.8 <noreply@anthropic.com>
</commit_message>
<xml_diff>
--- a/resume.docx
+++ b/resume.docx
@@ -2346,7 +2346,25 @@
           <w:sz w:val="24"/>
           <w:szCs w:val="24"/>
         </w:rPr>
-        <w:t xml:space="preserve"> team developing the packaging and pricing model, collaborating cross-functionally with </w:t>
+        <w:t xml:space="preserve"> team </w:t>
+      </w:r>
+      <w:proofErr w:type="gramStart"/>
+      <w:r>
+        <w:rPr>
+          <w:rFonts w:ascii="Garamond" w:hAnsi="Garamond" w:cs="Garamond"/>
+          <w:sz w:val="24"/>
+          <w:szCs w:val="24"/>
+        </w:rPr>
+        <w:t>developing</w:t>
+      </w:r>
+      <w:proofErr w:type="gramEnd"/>
+      <w:r>
+        <w:rPr>
+          <w:rFonts w:ascii="Garamond" w:hAnsi="Garamond" w:cs="Garamond"/>
+          <w:sz w:val="24"/>
+          <w:szCs w:val="24"/>
+        </w:rPr>
+        <w:t xml:space="preserve"> the packaging and pricing model, collaborating cross-functionally with </w:t>
       </w:r>
       <w:r>
         <w:rPr>
@@ -2872,15 +2890,27 @@
           <w:szCs w:val="24"/>
         </w:rPr>
       </w:pPr>
-      <w:r>
-        <w:rPr>
-          <w:rFonts w:ascii="Garamond" w:hAnsi="Garamond" w:cs="Garamond"/>
-          <w:b/>
-          <w:bCs/>
-          <w:sz w:val="24"/>
-          <w:szCs w:val="24"/>
-        </w:rPr>
-        <w:t>Audare AI</w:t>
+      <w:proofErr w:type="spellStart"/>
+      <w:r>
+        <w:rPr>
+          <w:rFonts w:ascii="Garamond" w:hAnsi="Garamond" w:cs="Garamond"/>
+          <w:b/>
+          <w:bCs/>
+          <w:sz w:val="24"/>
+          <w:szCs w:val="24"/>
+        </w:rPr>
+        <w:t>Audare</w:t>
+      </w:r>
+      <w:proofErr w:type="spellEnd"/>
+      <w:r>
+        <w:rPr>
+          <w:rFonts w:ascii="Garamond" w:hAnsi="Garamond" w:cs="Garamond"/>
+          <w:b/>
+          <w:bCs/>
+          <w:sz w:val="24"/>
+          <w:szCs w:val="24"/>
+        </w:rPr>
+        <w:t xml:space="preserve"> AI</w:t>
       </w:r>
       <w:r>
         <w:rPr>
@@ -3004,7 +3034,47 @@
           <w:sz w:val="24"/>
           <w:szCs w:val="24"/>
         </w:rPr>
-        <w:t xml:space="preserve"> (Part-Time)</w:t>
+        <w:t xml:space="preserve"> (</w:t>
+      </w:r>
+      <w:r>
+        <w:rPr>
+          <w:rFonts w:ascii="Garamond" w:hAnsi="Garamond" w:cs="Garamond"/>
+          <w:i/>
+          <w:iCs/>
+          <w:sz w:val="24"/>
+          <w:szCs w:val="24"/>
+        </w:rPr>
+        <w:t>p</w:t>
+      </w:r>
+      <w:r>
+        <w:rPr>
+          <w:rFonts w:ascii="Garamond" w:hAnsi="Garamond" w:cs="Garamond"/>
+          <w:i/>
+          <w:iCs/>
+          <w:sz w:val="24"/>
+          <w:szCs w:val="24"/>
+        </w:rPr>
+        <w:t>art-</w:t>
+      </w:r>
+      <w:r>
+        <w:rPr>
+          <w:rFonts w:ascii="Garamond" w:hAnsi="Garamond" w:cs="Garamond"/>
+          <w:i/>
+          <w:iCs/>
+          <w:sz w:val="24"/>
+          <w:szCs w:val="24"/>
+        </w:rPr>
+        <w:t>t</w:t>
+      </w:r>
+      <w:r>
+        <w:rPr>
+          <w:rFonts w:ascii="Garamond" w:hAnsi="Garamond" w:cs="Garamond"/>
+          <w:i/>
+          <w:iCs/>
+          <w:sz w:val="24"/>
+          <w:szCs w:val="24"/>
+        </w:rPr>
+        <w:t>ime)</w:t>
       </w:r>
       <w:r>
         <w:rPr>
@@ -3073,7 +3143,7 @@
           <w:sz w:val="24"/>
           <w:szCs w:val="24"/>
         </w:rPr>
-        <w:t>Ongoing</w:t>
+        <w:t>November 2025</w:t>
       </w:r>
     </w:p>
     <w:p>
@@ -3245,6 +3315,7 @@
           <w:szCs w:val="24"/>
         </w:rPr>
       </w:pPr>
+      <w:proofErr w:type="spellStart"/>
       <w:r>
         <w:rPr>
           <w:rFonts w:ascii="Garamond" w:hAnsi="Garamond" w:cs="Garamond"/>
@@ -3255,6 +3326,7 @@
         </w:rPr>
         <w:t>Yipitdata</w:t>
       </w:r>
+      <w:proofErr w:type="spellEnd"/>
       <w:r>
         <w:rPr>
           <w:sz w:val="28"/>
@@ -3611,7 +3683,25 @@
           <w:sz w:val="24"/>
           <w:szCs w:val="24"/>
         </w:rPr>
-        <w:t xml:space="preserve">Built the internal reporting DAG, which required extensive ETL on data pulled from REST APIs and source tables with Pyspark and SQL, setting up extensive QA, building an </w:t>
+        <w:t xml:space="preserve">Built the internal reporting DAG, which required extensive ETL on data pulled from REST APIs and source tables with </w:t>
+      </w:r>
+      <w:proofErr w:type="spellStart"/>
+      <w:r>
+        <w:rPr>
+          <w:rFonts w:ascii="Garamond" w:hAnsi="Garamond" w:cs="Garamond"/>
+          <w:sz w:val="24"/>
+          <w:szCs w:val="24"/>
+        </w:rPr>
+        <w:t>Pyspark</w:t>
+      </w:r>
+      <w:proofErr w:type="spellEnd"/>
+      <w:r>
+        <w:rPr>
+          <w:rFonts w:ascii="Garamond" w:hAnsi="Garamond" w:cs="Garamond"/>
+          <w:sz w:val="24"/>
+          <w:szCs w:val="24"/>
+        </w:rPr>
+        <w:t xml:space="preserve"> and SQL, setting up extensive QA, building an </w:t>
       </w:r>
       <w:r>
         <w:rPr>

</xml_diff>